<commit_message>
Day 7 Work has been Completed
</commit_message>
<xml_diff>
--- a/docs/Plan.docx
+++ b/docs/Plan.docx
@@ -48,13 +48,77 @@
         <w:t>Rule:</w:t>
       </w:r>
       <w:r>
-        <w:t xml:space="preserve"> Daily 2 hours. Pehle "concept/resource" samjho (20-30 min), phir "code" karo (90 min). AI se code samjho, likhwao, phir khud type/dobara likho — copy-paste nahi.</w:t>
+        <w:t xml:space="preserve"> Daily 2 hours. Pehle "concept/resource" </w:t>
+      </w:r>
+      <w:proofErr w:type="spellStart"/>
+      <w:r>
+        <w:t>samjho</w:t>
+      </w:r>
+      <w:proofErr w:type="spellEnd"/>
+      <w:r>
+        <w:t xml:space="preserve"> (20-30 min), </w:t>
+      </w:r>
+      <w:proofErr w:type="spellStart"/>
+      <w:r>
+        <w:t>phir</w:t>
+      </w:r>
+      <w:proofErr w:type="spellEnd"/>
+      <w:r>
+        <w:t xml:space="preserve"> "code" karo (90 min). AI se code </w:t>
+      </w:r>
+      <w:proofErr w:type="spellStart"/>
+      <w:r>
+        <w:t>samjho</w:t>
+      </w:r>
+      <w:proofErr w:type="spellEnd"/>
+      <w:r>
+        <w:t xml:space="preserve">, </w:t>
+      </w:r>
+      <w:proofErr w:type="spellStart"/>
+      <w:r>
+        <w:t>likhwao</w:t>
+      </w:r>
+      <w:proofErr w:type="spellEnd"/>
+      <w:r>
+        <w:t xml:space="preserve">, </w:t>
+      </w:r>
+      <w:proofErr w:type="spellStart"/>
+      <w:r>
+        <w:t>phir</w:t>
+      </w:r>
+      <w:proofErr w:type="spellEnd"/>
+      <w:r>
+        <w:t xml:space="preserve"> khud type/</w:t>
+      </w:r>
+      <w:proofErr w:type="spellStart"/>
+      <w:r>
+        <w:t>dobara</w:t>
+      </w:r>
+      <w:proofErr w:type="spellEnd"/>
+      <w:r>
+        <w:t xml:space="preserve"> </w:t>
+      </w:r>
+      <w:proofErr w:type="spellStart"/>
+      <w:r>
+        <w:t>likho</w:t>
+      </w:r>
+      <w:proofErr w:type="spellEnd"/>
+      <w:r>
+        <w:t xml:space="preserve"> — copy-paste </w:t>
+      </w:r>
+      <w:proofErr w:type="spellStart"/>
+      <w:r>
+        <w:t>nahi</w:t>
+      </w:r>
+      <w:proofErr w:type="spellEnd"/>
+      <w:r>
+        <w:t>.</w:t>
       </w:r>
     </w:p>
     <w:p>
       <w:r>
         <w:pict w14:anchorId="58F7C761">
-          <v:rect id="_x0000_i1055" style="width:0;height:1.5pt" o:hralign="center" o:hrstd="t" o:hr="t" fillcolor="#a0a0a0" stroked="f"/>
+          <v:rect id="_x0000_i1025" style="width:0;height:1.5pt" o:hralign="center" o:hrstd="t" o:hr="t" fillcolor="#a0a0a0" stroked="f"/>
         </w:pict>
       </w:r>
     </w:p>
@@ -103,7 +167,15 @@
         <w:t>Cover before coding:</w:t>
       </w:r>
       <w:r>
-        <w:t xml:space="preserve"> Python venv, pip, Django project vs app structure, settings.py basics, PostgreSQL install + creating a DB/user.</w:t>
+        <w:t xml:space="preserve"> Python </w:t>
+      </w:r>
+      <w:proofErr w:type="spellStart"/>
+      <w:r>
+        <w:t>venv</w:t>
+      </w:r>
+      <w:proofErr w:type="spellEnd"/>
+      <w:r>
+        <w:t>, pip, Django project vs app structure, settings.py basics, PostgreSQL install + creating a DB/user.</w:t>
       </w:r>
     </w:p>
     <w:p>
@@ -132,7 +204,15 @@
         </w:numPr>
       </w:pPr>
       <w:r>
-        <w:t>Virtual environment banao, Django install karo</w:t>
+        <w:t xml:space="preserve">Virtual environment </w:t>
+      </w:r>
+      <w:proofErr w:type="spellStart"/>
+      <w:r>
+        <w:t>banao</w:t>
+      </w:r>
+      <w:proofErr w:type="spellEnd"/>
+      <w:r>
+        <w:t>, Django install karo</w:t>
       </w:r>
     </w:p>
     <w:p>
@@ -142,9 +222,27 @@
           <w:numId w:val="1"/>
         </w:numPr>
       </w:pPr>
-      <w:r>
-        <w:t>django-admin startproject vustars_backend</w:t>
-      </w:r>
+      <w:proofErr w:type="spellStart"/>
+      <w:r>
+        <w:t>django</w:t>
+      </w:r>
+      <w:proofErr w:type="spellEnd"/>
+      <w:r>
+        <w:t xml:space="preserve">-admin </w:t>
+      </w:r>
+      <w:proofErr w:type="spellStart"/>
+      <w:r>
+        <w:t>startproject</w:t>
+      </w:r>
+      <w:proofErr w:type="spellEnd"/>
+      <w:r>
+        <w:t xml:space="preserve"> </w:t>
+      </w:r>
+      <w:proofErr w:type="spellStart"/>
+      <w:r>
+        <w:t>vustars_backend</w:t>
+      </w:r>
+      <w:proofErr w:type="spellEnd"/>
     </w:p>
     <w:p>
       <w:pPr>
@@ -154,8 +252,21 @@
         </w:numPr>
       </w:pPr>
       <w:r>
-        <w:t>psycopg2-binary install, DATABASES config PostgreSQL ke liye</w:t>
-      </w:r>
+        <w:t xml:space="preserve">psycopg2-binary install, DATABASES config PostgreSQL </w:t>
+      </w:r>
+      <w:proofErr w:type="spellStart"/>
+      <w:r>
+        <w:t>ke</w:t>
+      </w:r>
+      <w:proofErr w:type="spellEnd"/>
+      <w:r>
+        <w:t xml:space="preserve"> </w:t>
+      </w:r>
+      <w:proofErr w:type="spellStart"/>
+      <w:r>
+        <w:t>liye</w:t>
+      </w:r>
+      <w:proofErr w:type="spellEnd"/>
     </w:p>
     <w:p>
       <w:pPr>
@@ -165,8 +276,43 @@
         </w:numPr>
       </w:pPr>
       <w:r>
-        <w:t xml:space="preserve">Git init, proper .gitignore (venv, .env, </w:t>
-      </w:r>
+        <w:t xml:space="preserve">Git </w:t>
+      </w:r>
+      <w:proofErr w:type="spellStart"/>
+      <w:r>
+        <w:t>init</w:t>
+      </w:r>
+      <w:proofErr w:type="spellEnd"/>
+      <w:r>
+        <w:t xml:space="preserve">, </w:t>
+      </w:r>
+      <w:proofErr w:type="gramStart"/>
+      <w:r>
+        <w:t>proper .</w:t>
+      </w:r>
+      <w:proofErr w:type="spellStart"/>
+      <w:r>
+        <w:t>gitignore</w:t>
+      </w:r>
+      <w:proofErr w:type="spellEnd"/>
+      <w:proofErr w:type="gramEnd"/>
+      <w:r>
+        <w:t xml:space="preserve"> (</w:t>
+      </w:r>
+      <w:proofErr w:type="spellStart"/>
+      <w:r>
+        <w:t>venv</w:t>
+      </w:r>
+      <w:proofErr w:type="spellEnd"/>
+      <w:proofErr w:type="gramStart"/>
+      <w:r>
+        <w:t>, .env</w:t>
+      </w:r>
+      <w:proofErr w:type="gramEnd"/>
+      <w:r>
+        <w:t xml:space="preserve">, </w:t>
+      </w:r>
+      <w:proofErr w:type="spellStart"/>
       <w:r>
         <w:rPr>
           <w:b/>
@@ -174,6 +320,7 @@
         </w:rPr>
         <w:t>pycache</w:t>
       </w:r>
+      <w:proofErr w:type="spellEnd"/>
       <w:r>
         <w:t>)</w:t>
       </w:r>
@@ -193,7 +340,23 @@
         <w:t>Deliverable:</w:t>
       </w:r>
       <w:r>
-        <w:t xml:space="preserve"> Django server PostgreSQL se connected chal raha ho.</w:t>
+        <w:t xml:space="preserve"> Django server PostgreSQL se connected </w:t>
+      </w:r>
+      <w:proofErr w:type="spellStart"/>
+      <w:r>
+        <w:t>chal</w:t>
+      </w:r>
+      <w:proofErr w:type="spellEnd"/>
+      <w:r>
+        <w:t xml:space="preserve"> </w:t>
+      </w:r>
+      <w:proofErr w:type="spellStart"/>
+      <w:r>
+        <w:t>raha</w:t>
+      </w:r>
+      <w:proofErr w:type="spellEnd"/>
+      <w:r>
+        <w:t xml:space="preserve"> ho.</w:t>
       </w:r>
     </w:p>
     <w:p>
@@ -226,15 +389,120 @@
         <w:t>Cover before coding:</w:t>
       </w:r>
       <w:r>
-        <w:t xml:space="preserve"> Django apps kya hote hain (project vs app), AbstractUser kyun use karte hain aur </w:t>
-      </w:r>
-      <w:r>
-        <w:rPr>
-          <w:b/>
-          <w:bCs/>
-        </w:rPr>
-        <w:t>kyun ye first migration se pehle hi karna zaroori hai</w:t>
-      </w:r>
+        <w:t xml:space="preserve"> Django apps </w:t>
+      </w:r>
+      <w:proofErr w:type="spellStart"/>
+      <w:r>
+        <w:t>kya</w:t>
+      </w:r>
+      <w:proofErr w:type="spellEnd"/>
+      <w:r>
+        <w:t xml:space="preserve"> </w:t>
+      </w:r>
+      <w:proofErr w:type="spellStart"/>
+      <w:r>
+        <w:t>hote</w:t>
+      </w:r>
+      <w:proofErr w:type="spellEnd"/>
+      <w:r>
+        <w:t xml:space="preserve"> </w:t>
+      </w:r>
+      <w:proofErr w:type="spellStart"/>
+      <w:r>
+        <w:t>hain</w:t>
+      </w:r>
+      <w:proofErr w:type="spellEnd"/>
+      <w:r>
+        <w:t xml:space="preserve"> (project vs app), </w:t>
+      </w:r>
+      <w:proofErr w:type="spellStart"/>
+      <w:r>
+        <w:t>AbstractUser</w:t>
+      </w:r>
+      <w:proofErr w:type="spellEnd"/>
+      <w:r>
+        <w:t xml:space="preserve"> kyun use </w:t>
+      </w:r>
+      <w:proofErr w:type="spellStart"/>
+      <w:r>
+        <w:t>karte</w:t>
+      </w:r>
+      <w:proofErr w:type="spellEnd"/>
+      <w:r>
+        <w:t xml:space="preserve"> </w:t>
+      </w:r>
+      <w:proofErr w:type="spellStart"/>
+      <w:r>
+        <w:t>hain</w:t>
+      </w:r>
+      <w:proofErr w:type="spellEnd"/>
+      <w:r>
+        <w:t xml:space="preserve"> aur </w:t>
+      </w:r>
+      <w:r>
+        <w:rPr>
+          <w:b/>
+          <w:bCs/>
+        </w:rPr>
+        <w:t xml:space="preserve">kyun ye first migration se </w:t>
+      </w:r>
+      <w:proofErr w:type="spellStart"/>
+      <w:r>
+        <w:rPr>
+          <w:b/>
+          <w:bCs/>
+        </w:rPr>
+        <w:t>pehle</w:t>
+      </w:r>
+      <w:proofErr w:type="spellEnd"/>
+      <w:r>
+        <w:rPr>
+          <w:b/>
+          <w:bCs/>
+        </w:rPr>
+        <w:t xml:space="preserve"> hi </w:t>
+      </w:r>
+      <w:proofErr w:type="spellStart"/>
+      <w:r>
+        <w:rPr>
+          <w:b/>
+          <w:bCs/>
+        </w:rPr>
+        <w:t>karna</w:t>
+      </w:r>
+      <w:proofErr w:type="spellEnd"/>
+      <w:r>
+        <w:rPr>
+          <w:b/>
+          <w:bCs/>
+        </w:rPr>
+        <w:t xml:space="preserve"> </w:t>
+      </w:r>
+      <w:proofErr w:type="spellStart"/>
+      <w:r>
+        <w:rPr>
+          <w:b/>
+          <w:bCs/>
+        </w:rPr>
+        <w:t>zaroori</w:t>
+      </w:r>
+      <w:proofErr w:type="spellEnd"/>
+      <w:r>
+        <w:rPr>
+          <w:b/>
+          <w:bCs/>
+        </w:rPr>
+        <w:t xml:space="preserve"> </w:t>
+      </w:r>
+      <w:proofErr w:type="spellStart"/>
+      <w:r>
+        <w:rPr>
+          <w:b/>
+          <w:bCs/>
+        </w:rPr>
+        <w:t>hai</w:t>
+      </w:r>
+      <w:proofErr w:type="spellEnd"/>
       <w:r>
         <w:t>.</w:t>
       </w:r>
@@ -265,7 +533,15 @@
         </w:numPr>
       </w:pPr>
       <w:r>
-        <w:t>Apps banao: users, courses, resources</w:t>
+        <w:t xml:space="preserve">Apps </w:t>
+      </w:r>
+      <w:proofErr w:type="spellStart"/>
+      <w:r>
+        <w:t>banao</w:t>
+      </w:r>
+      <w:proofErr w:type="spellEnd"/>
+      <w:r>
+        <w:t>: users, courses, resources</w:t>
       </w:r>
     </w:p>
     <w:p>
@@ -275,8 +551,39 @@
           <w:numId w:val="2"/>
         </w:numPr>
       </w:pPr>
-      <w:r>
-        <w:t>users app me CustomUser(AbstractUser) model banao (role field: student/admin/moderator)</w:t>
+      <w:proofErr w:type="gramStart"/>
+      <w:r>
+        <w:t>users</w:t>
+      </w:r>
+      <w:proofErr w:type="gramEnd"/>
+      <w:r>
+        <w:t xml:space="preserve"> app me </w:t>
+      </w:r>
+      <w:proofErr w:type="spellStart"/>
+      <w:proofErr w:type="gramStart"/>
+      <w:r>
+        <w:t>CustomUser</w:t>
+      </w:r>
+      <w:proofErr w:type="spellEnd"/>
+      <w:r>
+        <w:t>(</w:t>
+      </w:r>
+      <w:proofErr w:type="spellStart"/>
+      <w:proofErr w:type="gramEnd"/>
+      <w:r>
+        <w:t>AbstractUser</w:t>
+      </w:r>
+      <w:proofErr w:type="spellEnd"/>
+      <w:r>
+        <w:t xml:space="preserve">) model </w:t>
+      </w:r>
+      <w:proofErr w:type="spellStart"/>
+      <w:r>
+        <w:t>banao</w:t>
+      </w:r>
+      <w:proofErr w:type="spellEnd"/>
+      <w:r>
+        <w:t xml:space="preserve"> (role field: student/admin/moderator)</w:t>
       </w:r>
     </w:p>
     <w:p>
@@ -305,7 +612,23 @@
         <w:t>Deliverable:</w:t>
       </w:r>
       <w:r>
-        <w:t xml:space="preserve"> Custom user model working, superuser bana ke admin panel me login.</w:t>
+        <w:t xml:space="preserve"> Custom user model working, superuser </w:t>
+      </w:r>
+      <w:proofErr w:type="spellStart"/>
+      <w:r>
+        <w:t>bana</w:t>
+      </w:r>
+      <w:proofErr w:type="spellEnd"/>
+      <w:r>
+        <w:t xml:space="preserve"> </w:t>
+      </w:r>
+      <w:proofErr w:type="spellStart"/>
+      <w:r>
+        <w:t>ke</w:t>
+      </w:r>
+      <w:proofErr w:type="spellEnd"/>
+      <w:r>
+        <w:t xml:space="preserve"> admin panel me login.</w:t>
       </w:r>
     </w:p>
     <w:p>
@@ -338,7 +661,31 @@
         <w:t>Cover before coding:</w:t>
       </w:r>
       <w:r>
-        <w:t xml:space="preserve"> REST API kya hota hai, Serializer/View/Router ka basic flow.</w:t>
+        <w:t xml:space="preserve"> REST API </w:t>
+      </w:r>
+      <w:proofErr w:type="spellStart"/>
+      <w:r>
+        <w:t>kya</w:t>
+      </w:r>
+      <w:proofErr w:type="spellEnd"/>
+      <w:r>
+        <w:t xml:space="preserve"> </w:t>
+      </w:r>
+      <w:proofErr w:type="spellStart"/>
+      <w:r>
+        <w:t>hota</w:t>
+      </w:r>
+      <w:proofErr w:type="spellEnd"/>
+      <w:r>
+        <w:t xml:space="preserve"> </w:t>
+      </w:r>
+      <w:proofErr w:type="spellStart"/>
+      <w:r>
+        <w:t>hai</w:t>
+      </w:r>
+      <w:proofErr w:type="spellEnd"/>
+      <w:r>
+        <w:t>, Serializer/View/Router ka basic flow.</w:t>
       </w:r>
     </w:p>
     <w:p>
@@ -366,8 +713,13 @@
           <w:numId w:val="3"/>
         </w:numPr>
       </w:pPr>
-      <w:r>
-        <w:t>djangorestframework install, INSTALLED_APPS me add</w:t>
+      <w:proofErr w:type="spellStart"/>
+      <w:r>
+        <w:t>djangorestframework</w:t>
+      </w:r>
+      <w:proofErr w:type="spellEnd"/>
+      <w:r>
+        <w:t xml:space="preserve"> install, INSTALLED_APPS me add</w:t>
       </w:r>
     </w:p>
     <w:p>
@@ -378,7 +730,31 @@
         </w:numPr>
       </w:pPr>
       <w:r>
-        <w:t>Ek simple test model + serializer + APIView bana ke browsable API test karo</w:t>
+        <w:t xml:space="preserve">Ek simple test model + serializer + </w:t>
+      </w:r>
+      <w:proofErr w:type="spellStart"/>
+      <w:r>
+        <w:t>APIView</w:t>
+      </w:r>
+      <w:proofErr w:type="spellEnd"/>
+      <w:r>
+        <w:t xml:space="preserve"> </w:t>
+      </w:r>
+      <w:proofErr w:type="spellStart"/>
+      <w:r>
+        <w:t>bana</w:t>
+      </w:r>
+      <w:proofErr w:type="spellEnd"/>
+      <w:r>
+        <w:t xml:space="preserve"> </w:t>
+      </w:r>
+      <w:proofErr w:type="spellStart"/>
+      <w:r>
+        <w:t>ke</w:t>
+      </w:r>
+      <w:proofErr w:type="spellEnd"/>
+      <w:r>
+        <w:t xml:space="preserve"> browsable API test karo</w:t>
       </w:r>
     </w:p>
     <w:p>
@@ -396,21 +772,38 @@
         <w:t>Deliverable:</w:t>
       </w:r>
       <w:r>
-        <w:t xml:space="preserve"> Ek dummy endpoint browser me DRF ka interface dikhaye.</w:t>
-      </w:r>
-    </w:p>
-    <w:p>
-      <w:pPr>
-        <w:rPr>
-          <w:b/>
-          <w:bCs/>
-        </w:rPr>
-      </w:pPr>
-      <w:r>
-        <w:rPr>
-          <w:b/>
-          <w:bCs/>
-        </w:rPr>
+        <w:t xml:space="preserve"> Ek dummy endpoint browser me DRF ka interface </w:t>
+      </w:r>
+      <w:proofErr w:type="spellStart"/>
+      <w:r>
+        <w:t>dikhaye</w:t>
+      </w:r>
+      <w:proofErr w:type="spellEnd"/>
+      <w:r>
+        <w:t>.</w:t>
+      </w:r>
+    </w:p>
+    <w:p>
+      <w:pPr>
+        <w:rPr>
+          <w:b/>
+          <w:bCs/>
+        </w:rPr>
+      </w:pPr>
+    </w:p>
+    <w:p>
+      <w:pPr>
+        <w:rPr>
+          <w:b/>
+          <w:bCs/>
+        </w:rPr>
+      </w:pPr>
+      <w:r>
+        <w:rPr>
+          <w:b/>
+          <w:bCs/>
+        </w:rPr>
+        <w:lastRenderedPageBreak/>
         <w:t>Day 4: Database Design (ER Diagram) + Courses App Models</w:t>
       </w:r>
     </w:p>
@@ -429,7 +822,39 @@
         <w:t>Cover before coding:</w:t>
       </w:r>
       <w:r>
-        <w:t xml:space="preserve"> ER diagram design karna (kaghaz pe ya draw.io) — Department, Course, Semester, Resource, Comment relationships samjho (FK vs M2M).</w:t>
+        <w:t xml:space="preserve"> ER diagram design </w:t>
+      </w:r>
+      <w:proofErr w:type="spellStart"/>
+      <w:r>
+        <w:t>karna</w:t>
+      </w:r>
+      <w:proofErr w:type="spellEnd"/>
+      <w:r>
+        <w:t xml:space="preserve"> (</w:t>
+      </w:r>
+      <w:proofErr w:type="spellStart"/>
+      <w:r>
+        <w:t>kaghaz</w:t>
+      </w:r>
+      <w:proofErr w:type="spellEnd"/>
+      <w:r>
+        <w:t xml:space="preserve"> pe </w:t>
+      </w:r>
+      <w:proofErr w:type="spellStart"/>
+      <w:r>
+        <w:t>ya</w:t>
+      </w:r>
+      <w:proofErr w:type="spellEnd"/>
+      <w:r>
+        <w:t xml:space="preserve"> draw.io) — Department, Course, Semester, Resource, Comment relationships </w:t>
+      </w:r>
+      <w:proofErr w:type="spellStart"/>
+      <w:r>
+        <w:t>samjho</w:t>
+      </w:r>
+      <w:proofErr w:type="spellEnd"/>
+      <w:r>
+        <w:t xml:space="preserve"> (FK vs M2M).</w:t>
       </w:r>
     </w:p>
     <w:p>
@@ -487,13 +912,29 @@
         <w:t>Deliverable:</w:t>
       </w:r>
       <w:r>
-        <w:t xml:space="preserve"> Admin panel se Department → Course → Semester add kar sako.</w:t>
+        <w:t xml:space="preserve"> Admin panel se Department → Course → Semester add </w:t>
+      </w:r>
+      <w:proofErr w:type="spellStart"/>
+      <w:r>
+        <w:t>kar</w:t>
+      </w:r>
+      <w:proofErr w:type="spellEnd"/>
+      <w:r>
+        <w:t xml:space="preserve"> </w:t>
+      </w:r>
+      <w:proofErr w:type="spellStart"/>
+      <w:r>
+        <w:t>sako</w:t>
+      </w:r>
+      <w:proofErr w:type="spellEnd"/>
+      <w:r>
+        <w:t>.</w:t>
       </w:r>
     </w:p>
     <w:p>
       <w:r>
         <w:pict w14:anchorId="34A8BC64">
-          <v:rect id="_x0000_i1056" style="width:0;height:1.5pt" o:hralign="center" o:hrstd="t" o:hr="t" fillcolor="#a0a0a0" stroked="f"/>
+          <v:rect id="_x0000_i1026" style="width:0;height:1.5pt" o:hralign="center" o:hrstd="t" o:hr="t" fillcolor="#a0a0a0" stroked="f"/>
         </w:pict>
       </w:r>
     </w:p>
@@ -542,7 +983,23 @@
         <w:t>Cover before coding:</w:t>
       </w:r>
       <w:r>
-        <w:t xml:space="preserve"> Django FileField, choices field (TextChoices).</w:t>
+        <w:t xml:space="preserve"> Django </w:t>
+      </w:r>
+      <w:proofErr w:type="spellStart"/>
+      <w:r>
+        <w:t>FileField</w:t>
+      </w:r>
+      <w:proofErr w:type="spellEnd"/>
+      <w:r>
+        <w:t>, choices field (</w:t>
+      </w:r>
+      <w:proofErr w:type="spellStart"/>
+      <w:r>
+        <w:t>TextChoices</w:t>
+      </w:r>
+      <w:proofErr w:type="spellEnd"/>
+      <w:r>
+        <w:t>).</w:t>
       </w:r>
     </w:p>
     <w:p>
@@ -571,8 +1028,53 @@
         </w:numPr>
       </w:pPr>
       <w:r>
-        <w:t>Resource model: title, file, resource_type (handout/midterm/final/gdb/quiz — TextChoices), course (FK), semester (FK), uploaded_by (FK User), uploaded_at, downloads_count</w:t>
-      </w:r>
+        <w:t xml:space="preserve">Resource model: title, file, </w:t>
+      </w:r>
+      <w:proofErr w:type="spellStart"/>
+      <w:r>
+        <w:t>resource_type</w:t>
+      </w:r>
+      <w:proofErr w:type="spellEnd"/>
+      <w:r>
+        <w:t xml:space="preserve"> (handout/midterm/final/</w:t>
+      </w:r>
+      <w:proofErr w:type="spellStart"/>
+      <w:r>
+        <w:t>gdb</w:t>
+      </w:r>
+      <w:proofErr w:type="spellEnd"/>
+      <w:r>
+        <w:t xml:space="preserve">/quiz — </w:t>
+      </w:r>
+      <w:proofErr w:type="spellStart"/>
+      <w:r>
+        <w:t>TextChoices</w:t>
+      </w:r>
+      <w:proofErr w:type="spellEnd"/>
+      <w:r>
+        <w:t xml:space="preserve">), course (FK), semester (FK), </w:t>
+      </w:r>
+      <w:proofErr w:type="spellStart"/>
+      <w:r>
+        <w:t>uploaded_by</w:t>
+      </w:r>
+      <w:proofErr w:type="spellEnd"/>
+      <w:r>
+        <w:t xml:space="preserve"> (FK User), </w:t>
+      </w:r>
+      <w:proofErr w:type="spellStart"/>
+      <w:r>
+        <w:t>uploaded_at</w:t>
+      </w:r>
+      <w:proofErr w:type="spellEnd"/>
+      <w:r>
+        <w:t xml:space="preserve">, </w:t>
+      </w:r>
+      <w:proofErr w:type="spellStart"/>
+      <w:r>
+        <w:t>downloads_count</w:t>
+      </w:r>
+      <w:proofErr w:type="spellEnd"/>
     </w:p>
     <w:p>
       <w:pPr>
@@ -651,8 +1153,21 @@
         </w:numPr>
       </w:pPr>
       <w:r>
-        <w:t>File size/type validator (FileExtensionValidator) Resource model pe lagao</w:t>
-      </w:r>
+        <w:t>File size/type validator (</w:t>
+      </w:r>
+      <w:proofErr w:type="spellStart"/>
+      <w:r>
+        <w:t>FileExtensionValidator</w:t>
+      </w:r>
+      <w:proofErr w:type="spellEnd"/>
+      <w:r>
+        <w:t xml:space="preserve">) Resource model pe </w:t>
+      </w:r>
+      <w:proofErr w:type="spellStart"/>
+      <w:r>
+        <w:t>lagao</w:t>
+      </w:r>
+      <w:proofErr w:type="spellEnd"/>
     </w:p>
     <w:p>
       <w:pPr>
@@ -662,7 +1177,15 @@
         </w:numPr>
       </w:pPr>
       <w:r>
-        <w:t>Media serving config karo, ek file upload karke URL se access karo</w:t>
+        <w:t xml:space="preserve">Media serving config karo, ek file upload </w:t>
+      </w:r>
+      <w:proofErr w:type="spellStart"/>
+      <w:r>
+        <w:t>karke</w:t>
+      </w:r>
+      <w:proofErr w:type="spellEnd"/>
+      <w:r>
+        <w:t xml:space="preserve"> URL se access karo</w:t>
       </w:r>
     </w:p>
     <w:p>
@@ -713,7 +1236,55 @@
         <w:t>Cover before coding:</w:t>
       </w:r>
       <w:r>
-        <w:t xml:space="preserve"> JWT kya hota hai (access + refresh token), session auth se kyun better hai React ke liye.</w:t>
+        <w:t xml:space="preserve"> JWT </w:t>
+      </w:r>
+      <w:proofErr w:type="spellStart"/>
+      <w:r>
+        <w:t>kya</w:t>
+      </w:r>
+      <w:proofErr w:type="spellEnd"/>
+      <w:r>
+        <w:t xml:space="preserve"> </w:t>
+      </w:r>
+      <w:proofErr w:type="spellStart"/>
+      <w:r>
+        <w:t>hota</w:t>
+      </w:r>
+      <w:proofErr w:type="spellEnd"/>
+      <w:r>
+        <w:t xml:space="preserve"> </w:t>
+      </w:r>
+      <w:proofErr w:type="spellStart"/>
+      <w:r>
+        <w:t>hai</w:t>
+      </w:r>
+      <w:proofErr w:type="spellEnd"/>
+      <w:r>
+        <w:t xml:space="preserve"> (access + refresh token), session auth se kyun better </w:t>
+      </w:r>
+      <w:proofErr w:type="spellStart"/>
+      <w:r>
+        <w:t>hai</w:t>
+      </w:r>
+      <w:proofErr w:type="spellEnd"/>
+      <w:r>
+        <w:t xml:space="preserve"> React </w:t>
+      </w:r>
+      <w:proofErr w:type="spellStart"/>
+      <w:r>
+        <w:t>ke</w:t>
+      </w:r>
+      <w:proofErr w:type="spellEnd"/>
+      <w:r>
+        <w:t xml:space="preserve"> </w:t>
+      </w:r>
+      <w:proofErr w:type="spellStart"/>
+      <w:r>
+        <w:t>liye</w:t>
+      </w:r>
+      <w:proofErr w:type="spellEnd"/>
+      <w:r>
+        <w:t>.</w:t>
       </w:r>
     </w:p>
     <w:p>
@@ -741,8 +1312,13 @@
           <w:numId w:val="7"/>
         </w:numPr>
       </w:pPr>
-      <w:r>
-        <w:t>djangorestframework-simplejwt install + config</w:t>
+      <w:proofErr w:type="spellStart"/>
+      <w:r>
+        <w:t>djangorestframework-simplejwt</w:t>
+      </w:r>
+      <w:proofErr w:type="spellEnd"/>
+      <w:r>
+        <w:t xml:space="preserve"> install + config</w:t>
       </w:r>
     </w:p>
     <w:p>
@@ -764,8 +1340,21 @@
         </w:numPr>
       </w:pPr>
       <w:r>
-        <w:t>Postman se test: register → login → protected endpoint hit karo token ke saath</w:t>
-      </w:r>
+        <w:t xml:space="preserve">Postman se test: register → login → protected endpoint hit karo token </w:t>
+      </w:r>
+      <w:proofErr w:type="spellStart"/>
+      <w:r>
+        <w:t>ke</w:t>
+      </w:r>
+      <w:proofErr w:type="spellEnd"/>
+      <w:r>
+        <w:t xml:space="preserve"> </w:t>
+      </w:r>
+      <w:proofErr w:type="spellStart"/>
+      <w:r>
+        <w:t>saath</w:t>
+      </w:r>
+      <w:proofErr w:type="spellEnd"/>
     </w:p>
     <w:p>
       <w:pPr>
@@ -782,7 +1371,39 @@
         <w:t>Deliverable:</w:t>
       </w:r>
       <w:r>
-        <w:t xml:space="preserve"> Working auth flow — token milta hai aur protected route access hoti hai.</w:t>
+        <w:t xml:space="preserve"> Working auth flow — token </w:t>
+      </w:r>
+      <w:proofErr w:type="spellStart"/>
+      <w:r>
+        <w:t>milta</w:t>
+      </w:r>
+      <w:proofErr w:type="spellEnd"/>
+      <w:r>
+        <w:t xml:space="preserve"> </w:t>
+      </w:r>
+      <w:proofErr w:type="spellStart"/>
+      <w:r>
+        <w:t>hai</w:t>
+      </w:r>
+      <w:proofErr w:type="spellEnd"/>
+      <w:r>
+        <w:t xml:space="preserve"> aur protected route access </w:t>
+      </w:r>
+      <w:proofErr w:type="spellStart"/>
+      <w:r>
+        <w:t>hoti</w:t>
+      </w:r>
+      <w:proofErr w:type="spellEnd"/>
+      <w:r>
+        <w:t xml:space="preserve"> </w:t>
+      </w:r>
+      <w:proofErr w:type="spellStart"/>
+      <w:r>
+        <w:t>hai</w:t>
+      </w:r>
+      <w:proofErr w:type="spellEnd"/>
+      <w:r>
+        <w:t>.</w:t>
       </w:r>
     </w:p>
     <w:p>
@@ -812,10 +1433,51 @@
           <w:b/>
           <w:bCs/>
         </w:rPr>
+        <w:lastRenderedPageBreak/>
         <w:t>Cover before coding:</w:t>
       </w:r>
       <w:r>
-        <w:t xml:space="preserve"> DRF permission classes (IsAuthenticated, IsAdminUser), custom permission class kaise banate hain.</w:t>
+        <w:t xml:space="preserve"> DRF permission classes (</w:t>
+      </w:r>
+      <w:proofErr w:type="spellStart"/>
+      <w:r>
+        <w:t>IsAuthenticated</w:t>
+      </w:r>
+      <w:proofErr w:type="spellEnd"/>
+      <w:r>
+        <w:t xml:space="preserve">, </w:t>
+      </w:r>
+      <w:proofErr w:type="spellStart"/>
+      <w:r>
+        <w:t>IsAdminUser</w:t>
+      </w:r>
+      <w:proofErr w:type="spellEnd"/>
+      <w:r>
+        <w:t xml:space="preserve">), custom permission class </w:t>
+      </w:r>
+      <w:proofErr w:type="spellStart"/>
+      <w:r>
+        <w:t>kaise</w:t>
+      </w:r>
+      <w:proofErr w:type="spellEnd"/>
+      <w:r>
+        <w:t xml:space="preserve"> </w:t>
+      </w:r>
+      <w:proofErr w:type="spellStart"/>
+      <w:r>
+        <w:t>banate</w:t>
+      </w:r>
+      <w:proofErr w:type="spellEnd"/>
+      <w:r>
+        <w:t xml:space="preserve"> </w:t>
+      </w:r>
+      <w:proofErr w:type="spellStart"/>
+      <w:r>
+        <w:t>hain</w:t>
+      </w:r>
+      <w:proofErr w:type="spellEnd"/>
+      <w:r>
+        <w:t>.</w:t>
       </w:r>
     </w:p>
     <w:p>
@@ -844,7 +1506,15 @@
         </w:numPr>
       </w:pPr>
       <w:r>
-        <w:t>Custom IsAdminOrModerator permission class</w:t>
+        <w:t xml:space="preserve">Custom </w:t>
+      </w:r>
+      <w:proofErr w:type="spellStart"/>
+      <w:r>
+        <w:t>IsAdminOrModerator</w:t>
+      </w:r>
+      <w:proofErr w:type="spellEnd"/>
+      <w:r>
+        <w:t xml:space="preserve"> permission class</w:t>
       </w:r>
     </w:p>
     <w:p>
@@ -855,8 +1525,45 @@
         </w:numPr>
       </w:pPr>
       <w:r>
-        <w:t>Resource upload sirf admin/moderator kar sake, students sirf read kar sakein</w:t>
-      </w:r>
+        <w:t xml:space="preserve">Resource upload </w:t>
+      </w:r>
+      <w:proofErr w:type="spellStart"/>
+      <w:r>
+        <w:t>sirf</w:t>
+      </w:r>
+      <w:proofErr w:type="spellEnd"/>
+      <w:r>
+        <w:t xml:space="preserve"> admin/moderator </w:t>
+      </w:r>
+      <w:proofErr w:type="spellStart"/>
+      <w:r>
+        <w:t>kar</w:t>
+      </w:r>
+      <w:proofErr w:type="spellEnd"/>
+      <w:r>
+        <w:t xml:space="preserve"> sake, students </w:t>
+      </w:r>
+      <w:proofErr w:type="spellStart"/>
+      <w:r>
+        <w:t>sirf</w:t>
+      </w:r>
+      <w:proofErr w:type="spellEnd"/>
+      <w:r>
+        <w:t xml:space="preserve"> read </w:t>
+      </w:r>
+      <w:proofErr w:type="spellStart"/>
+      <w:r>
+        <w:t>kar</w:t>
+      </w:r>
+      <w:proofErr w:type="spellEnd"/>
+      <w:r>
+        <w:t xml:space="preserve"> </w:t>
+      </w:r>
+      <w:proofErr w:type="spellStart"/>
+      <w:r>
+        <w:t>sakein</w:t>
+      </w:r>
+      <w:proofErr w:type="spellEnd"/>
     </w:p>
     <w:p>
       <w:pPr>
@@ -873,7 +1580,23 @@
         <w:t>Deliverable:</w:t>
       </w:r>
       <w:r>
-        <w:t xml:space="preserve"> Student token se upload try karo → 403 error aana chahiye.</w:t>
+        <w:t xml:space="preserve"> Student token se upload try karo → 403 error </w:t>
+      </w:r>
+      <w:proofErr w:type="spellStart"/>
+      <w:r>
+        <w:t>aana</w:t>
+      </w:r>
+      <w:proofErr w:type="spellEnd"/>
+      <w:r>
+        <w:t xml:space="preserve"> </w:t>
+      </w:r>
+      <w:proofErr w:type="spellStart"/>
+      <w:r>
+        <w:t>chahiye</w:t>
+      </w:r>
+      <w:proofErr w:type="spellEnd"/>
+      <w:r>
+        <w:t>.</w:t>
       </w:r>
     </w:p>
     <w:p>
@@ -906,7 +1629,15 @@
         <w:t>Cover before coding:</w:t>
       </w:r>
       <w:r>
-        <w:t xml:space="preserve"> Nested serializers, SerializerMethodField, source argument.</w:t>
+        <w:t xml:space="preserve"> Nested serializers, </w:t>
+      </w:r>
+      <w:proofErr w:type="spellStart"/>
+      <w:r>
+        <w:t>SerializerMethodField</w:t>
+      </w:r>
+      <w:proofErr w:type="spellEnd"/>
+      <w:r>
+        <w:t>, source argument.</w:t>
       </w:r>
     </w:p>
     <w:p>
@@ -934,8 +1665,29 @@
           <w:numId w:val="9"/>
         </w:numPr>
       </w:pPr>
-      <w:r>
-        <w:t>ResourceSerializer me nested CourseSerializer dikhao (read-only)</w:t>
+      <w:proofErr w:type="spellStart"/>
+      <w:r>
+        <w:t>ResourceSerializer</w:t>
+      </w:r>
+      <w:proofErr w:type="spellEnd"/>
+      <w:r>
+        <w:t xml:space="preserve"> me nested </w:t>
+      </w:r>
+      <w:proofErr w:type="spellStart"/>
+      <w:r>
+        <w:t>CourseSerializer</w:t>
+      </w:r>
+      <w:proofErr w:type="spellEnd"/>
+      <w:r>
+        <w:t xml:space="preserve"> </w:t>
+      </w:r>
+      <w:proofErr w:type="spellStart"/>
+      <w:r>
+        <w:t>dikhao</w:t>
+      </w:r>
+      <w:proofErr w:type="spellEnd"/>
+      <w:r>
+        <w:t xml:space="preserve"> (read-only)</w:t>
       </w:r>
     </w:p>
     <w:p>
@@ -945,8 +1697,21 @@
           <w:numId w:val="9"/>
         </w:numPr>
       </w:pPr>
-      <w:r>
-        <w:t>download_url jaisa computed field add karo</w:t>
+      <w:proofErr w:type="spellStart"/>
+      <w:r>
+        <w:t>download_url</w:t>
+      </w:r>
+      <w:proofErr w:type="spellEnd"/>
+      <w:r>
+        <w:t xml:space="preserve"> </w:t>
+      </w:r>
+      <w:proofErr w:type="spellStart"/>
+      <w:r>
+        <w:t>jaisa</w:t>
+      </w:r>
+      <w:proofErr w:type="spellEnd"/>
+      <w:r>
+        <w:t xml:space="preserve"> computed field add karo</w:t>
       </w:r>
     </w:p>
     <w:p>
@@ -964,13 +1729,45 @@
         <w:t>Deliverable:</w:t>
       </w:r>
       <w:r>
-        <w:t xml:space="preserve"> API response me course ka naam bhi dikhe, sirf ID nahi.</w:t>
+        <w:t xml:space="preserve"> API response me course ka naam </w:t>
+      </w:r>
+      <w:proofErr w:type="spellStart"/>
+      <w:r>
+        <w:t>bhi</w:t>
+      </w:r>
+      <w:proofErr w:type="spellEnd"/>
+      <w:r>
+        <w:t xml:space="preserve"> </w:t>
+      </w:r>
+      <w:proofErr w:type="spellStart"/>
+      <w:r>
+        <w:t>dikhe</w:t>
+      </w:r>
+      <w:proofErr w:type="spellEnd"/>
+      <w:r>
+        <w:t xml:space="preserve">, </w:t>
+      </w:r>
+      <w:proofErr w:type="spellStart"/>
+      <w:r>
+        <w:t>sirf</w:t>
+      </w:r>
+      <w:proofErr w:type="spellEnd"/>
+      <w:r>
+        <w:t xml:space="preserve"> ID </w:t>
+      </w:r>
+      <w:proofErr w:type="spellStart"/>
+      <w:r>
+        <w:t>nahi</w:t>
+      </w:r>
+      <w:proofErr w:type="spellEnd"/>
+      <w:r>
+        <w:t>.</w:t>
       </w:r>
     </w:p>
     <w:p>
       <w:r>
         <w:pict w14:anchorId="48500E3C">
-          <v:rect id="_x0000_i1057" style="width:0;height:1.5pt" o:hralign="center" o:hrstd="t" o:hr="t" fillcolor="#a0a0a0" stroked="f"/>
+          <v:rect id="_x0000_i1027" style="width:0;height:1.5pt" o:hralign="center" o:hrstd="t" o:hr="t" fillcolor="#a0a0a0" stroked="f"/>
         </w:pict>
       </w:r>
     </w:p>
@@ -1001,7 +1798,23 @@
           <w:b/>
           <w:bCs/>
         </w:rPr>
-        <w:t>Day 10: ViewSets &amp; Routers</w:t>
+        <w:t xml:space="preserve">Day 10: </w:t>
+      </w:r>
+      <w:proofErr w:type="spellStart"/>
+      <w:r>
+        <w:rPr>
+          <w:b/>
+          <w:bCs/>
+        </w:rPr>
+        <w:t>ViewSets</w:t>
+      </w:r>
+      <w:proofErr w:type="spellEnd"/>
+      <w:r>
+        <w:rPr>
+          <w:b/>
+          <w:bCs/>
+        </w:rPr>
+        <w:t xml:space="preserve"> &amp; Routers</w:t>
       </w:r>
     </w:p>
     <w:p>
@@ -1019,7 +1832,31 @@
         <w:t>Cover:</w:t>
       </w:r>
       <w:r>
-        <w:t xml:space="preserve"> ModelViewSet vs APIView, DefaultRouter.</w:t>
+        <w:t xml:space="preserve"> </w:t>
+      </w:r>
+      <w:proofErr w:type="spellStart"/>
+      <w:r>
+        <w:t>ModelViewSet</w:t>
+      </w:r>
+      <w:proofErr w:type="spellEnd"/>
+      <w:r>
+        <w:t xml:space="preserve"> vs </w:t>
+      </w:r>
+      <w:proofErr w:type="spellStart"/>
+      <w:r>
+        <w:t>APIView</w:t>
+      </w:r>
+      <w:proofErr w:type="spellEnd"/>
+      <w:r>
+        <w:t xml:space="preserve">, </w:t>
+      </w:r>
+      <w:proofErr w:type="spellStart"/>
+      <w:r>
+        <w:t>DefaultRouter</w:t>
+      </w:r>
+      <w:proofErr w:type="spellEnd"/>
+      <w:r>
+        <w:t>.</w:t>
       </w:r>
     </w:p>
     <w:p>
@@ -1037,7 +1874,15 @@
         <w:t>Code:</w:t>
       </w:r>
       <w:r>
-        <w:t xml:space="preserve"> Resource, Course endpoints ko ModelViewSet me convert karo, router se URLs auto-generate karo.</w:t>
+        <w:t xml:space="preserve"> Resource, Course endpoints ko </w:t>
+      </w:r>
+      <w:proofErr w:type="spellStart"/>
+      <w:r>
+        <w:t>ModelViewSet</w:t>
+      </w:r>
+      <w:proofErr w:type="spellEnd"/>
+      <w:r>
+        <w:t xml:space="preserve"> me convert karo, router se URLs auto-generate karo.</w:t>
       </w:r>
     </w:p>
     <w:p>
@@ -1088,7 +1933,23 @@
         <w:t>Cover:</w:t>
       </w:r>
       <w:r>
-        <w:t xml:space="preserve"> django-filter package, DRF SearchFilter.</w:t>
+        <w:t xml:space="preserve"> </w:t>
+      </w:r>
+      <w:proofErr w:type="spellStart"/>
+      <w:r>
+        <w:t>django</w:t>
+      </w:r>
+      <w:proofErr w:type="spellEnd"/>
+      <w:r>
+        <w:t xml:space="preserve">-filter package, DRF </w:t>
+      </w:r>
+      <w:proofErr w:type="spellStart"/>
+      <w:r>
+        <w:t>SearchFilter</w:t>
+      </w:r>
+      <w:proofErr w:type="spellEnd"/>
+      <w:r>
+        <w:t>.</w:t>
       </w:r>
     </w:p>
     <w:p>
@@ -1124,7 +1985,39 @@
         <w:t>Deliverable:</w:t>
       </w:r>
       <w:r>
-        <w:t xml:space="preserve"> /resources/?course=1&amp;type=midterm&amp;search=data jaisa query kaam kare.</w:t>
+        <w:t xml:space="preserve"> /resources/?course=1&amp;type=</w:t>
+      </w:r>
+      <w:proofErr w:type="spellStart"/>
+      <w:r>
+        <w:t>midterm&amp;search</w:t>
+      </w:r>
+      <w:proofErr w:type="spellEnd"/>
+      <w:r>
+        <w:t xml:space="preserve">=data </w:t>
+      </w:r>
+      <w:proofErr w:type="spellStart"/>
+      <w:r>
+        <w:t>jaisa</w:t>
+      </w:r>
+      <w:proofErr w:type="spellEnd"/>
+      <w:r>
+        <w:t xml:space="preserve"> query </w:t>
+      </w:r>
+      <w:proofErr w:type="spellStart"/>
+      <w:r>
+        <w:t>kaam</w:t>
+      </w:r>
+      <w:proofErr w:type="spellEnd"/>
+      <w:r>
+        <w:t xml:space="preserve"> </w:t>
+      </w:r>
+      <w:proofErr w:type="spellStart"/>
+      <w:r>
+        <w:t>kare</w:t>
+      </w:r>
+      <w:proofErr w:type="spellEnd"/>
+      <w:r>
+        <w:t>.</w:t>
       </w:r>
     </w:p>
     <w:p>
@@ -1157,7 +2050,23 @@
         <w:t>Cover:</w:t>
       </w:r>
       <w:r>
-        <w:t xml:space="preserve"> PageNumberPagination vs LimitOffsetPagination.</w:t>
+        <w:t xml:space="preserve"> </w:t>
+      </w:r>
+      <w:proofErr w:type="spellStart"/>
+      <w:r>
+        <w:t>PageNumberPagination</w:t>
+      </w:r>
+      <w:proofErr w:type="spellEnd"/>
+      <w:r>
+        <w:t xml:space="preserve"> vs </w:t>
+      </w:r>
+      <w:proofErr w:type="spellStart"/>
+      <w:r>
+        <w:t>LimitOffsetPagination</w:t>
+      </w:r>
+      <w:proofErr w:type="spellEnd"/>
+      <w:r>
+        <w:t>.</w:t>
       </w:r>
     </w:p>
     <w:p>
@@ -1175,7 +2084,15 @@
         <w:t>Code:</w:t>
       </w:r>
       <w:r>
-        <w:t xml:space="preserve"> Custom pagination class (page_size=10) globally set karo.</w:t>
+        <w:t xml:space="preserve"> Custom pagination class (</w:t>
+      </w:r>
+      <w:proofErr w:type="spellStart"/>
+      <w:r>
+        <w:t>page_size</w:t>
+      </w:r>
+      <w:proofErr w:type="spellEnd"/>
+      <w:r>
+        <w:t>=10) globally set karo.</w:t>
       </w:r>
     </w:p>
     <w:p>
@@ -1193,7 +2110,15 @@
         <w:t>Deliverable:</w:t>
       </w:r>
       <w:r>
-        <w:t xml:space="preserve"> Response me count, next, previous, results structure dikhe.</w:t>
+        <w:t xml:space="preserve"> Response me count, next, previous, results structure </w:t>
+      </w:r>
+      <w:proofErr w:type="spellStart"/>
+      <w:r>
+        <w:t>dikhe</w:t>
+      </w:r>
+      <w:proofErr w:type="spellEnd"/>
+      <w:r>
+        <w:t>.</w:t>
       </w:r>
     </w:p>
     <w:p>
@@ -1226,7 +2151,23 @@
         <w:t>Cover:</w:t>
       </w:r>
       <w:r>
-        <w:t xml:space="preserve"> Nested resources (Comment belongs to Resource), ForeignKey related_name.</w:t>
+        <w:t xml:space="preserve"> Nested resources (Comment belongs to Resource), </w:t>
+      </w:r>
+      <w:proofErr w:type="spellStart"/>
+      <w:r>
+        <w:t>ForeignKey</w:t>
+      </w:r>
+      <w:proofErr w:type="spellEnd"/>
+      <w:r>
+        <w:t xml:space="preserve"> </w:t>
+      </w:r>
+      <w:proofErr w:type="spellStart"/>
+      <w:r>
+        <w:t>related_name</w:t>
+      </w:r>
+      <w:proofErr w:type="spellEnd"/>
+      <w:r>
+        <w:t>.</w:t>
       </w:r>
     </w:p>
     <w:p>
@@ -1262,21 +2203,70 @@
         <w:t>Deliverable:</w:t>
       </w:r>
       <w:r>
-        <w:t xml:space="preserve"> Student comment add kar sake, sirf apna comment delete kar sake.</w:t>
-      </w:r>
-    </w:p>
-    <w:p>
-      <w:pPr>
-        <w:rPr>
-          <w:b/>
-          <w:bCs/>
-        </w:rPr>
-      </w:pPr>
-      <w:r>
-        <w:rPr>
-          <w:b/>
-          <w:bCs/>
-        </w:rPr>
+        <w:t xml:space="preserve"> Student comment </w:t>
+      </w:r>
+      <w:proofErr w:type="gramStart"/>
+      <w:r>
+        <w:t>add</w:t>
+      </w:r>
+      <w:proofErr w:type="gramEnd"/>
+      <w:r>
+        <w:t xml:space="preserve"> </w:t>
+      </w:r>
+      <w:proofErr w:type="spellStart"/>
+      <w:r>
+        <w:t>kar</w:t>
+      </w:r>
+      <w:proofErr w:type="spellEnd"/>
+      <w:r>
+        <w:t xml:space="preserve"> sake, </w:t>
+      </w:r>
+      <w:proofErr w:type="spellStart"/>
+      <w:r>
+        <w:t>sirf</w:t>
+      </w:r>
+      <w:proofErr w:type="spellEnd"/>
+      <w:r>
+        <w:t xml:space="preserve"> </w:t>
+      </w:r>
+      <w:proofErr w:type="spellStart"/>
+      <w:r>
+        <w:t>apna</w:t>
+      </w:r>
+      <w:proofErr w:type="spellEnd"/>
+      <w:r>
+        <w:t xml:space="preserve"> comment </w:t>
+      </w:r>
+      <w:proofErr w:type="gramStart"/>
+      <w:r>
+        <w:t>delete</w:t>
+      </w:r>
+      <w:proofErr w:type="gramEnd"/>
+      <w:r>
+        <w:t xml:space="preserve"> </w:t>
+      </w:r>
+      <w:proofErr w:type="spellStart"/>
+      <w:r>
+        <w:t>kar</w:t>
+      </w:r>
+      <w:proofErr w:type="spellEnd"/>
+      <w:r>
+        <w:t xml:space="preserve"> sake.</w:t>
+      </w:r>
+    </w:p>
+    <w:p>
+      <w:pPr>
+        <w:rPr>
+          <w:b/>
+          <w:bCs/>
+        </w:rPr>
+      </w:pPr>
+      <w:r>
+        <w:rPr>
+          <w:b/>
+          <w:bCs/>
+        </w:rPr>
+        <w:lastRenderedPageBreak/>
         <w:t>Day 14: Download Tracking + Throttling</w:t>
       </w:r>
     </w:p>
@@ -1295,7 +2285,23 @@
         <w:t>Cover:</w:t>
       </w:r>
       <w:r>
-        <w:t xml:space="preserve"> DRF throttling classes (rate limiting kyun zaroori hai).</w:t>
+        <w:t xml:space="preserve"> DRF throttling classes (rate limiting kyun </w:t>
+      </w:r>
+      <w:proofErr w:type="spellStart"/>
+      <w:r>
+        <w:t>zaroori</w:t>
+      </w:r>
+      <w:proofErr w:type="spellEnd"/>
+      <w:r>
+        <w:t xml:space="preserve"> </w:t>
+      </w:r>
+      <w:proofErr w:type="spellStart"/>
+      <w:r>
+        <w:t>hai</w:t>
+      </w:r>
+      <w:proofErr w:type="spellEnd"/>
+      <w:r>
+        <w:t>).</w:t>
       </w:r>
     </w:p>
     <w:p>
@@ -1313,7 +2319,23 @@
         <w:t>Code:</w:t>
       </w:r>
       <w:r>
-        <w:t xml:space="preserve"> Custom /resources/&lt;id&gt;/download/ endpoint jo downloads_count +1 kare; throttle add karo (e.g. 10/min per user).</w:t>
+        <w:t xml:space="preserve"> Custom /resources/&lt;id&gt;/download/ endpoint jo </w:t>
+      </w:r>
+      <w:proofErr w:type="spellStart"/>
+      <w:r>
+        <w:t>downloads_count</w:t>
+      </w:r>
+      <w:proofErr w:type="spellEnd"/>
+      <w:r>
+        <w:t xml:space="preserve"> +1 </w:t>
+      </w:r>
+      <w:proofErr w:type="spellStart"/>
+      <w:r>
+        <w:t>kare</w:t>
+      </w:r>
+      <w:proofErr w:type="spellEnd"/>
+      <w:r>
+        <w:t>; throttle add karo (e.g. 10/min per user).</w:t>
       </w:r>
     </w:p>
     <w:p>
@@ -1331,7 +2353,23 @@
         <w:t>Deliverable:</w:t>
       </w:r>
       <w:r>
-        <w:t xml:space="preserve"> Har download count badhta dikhe, spam requests block ho.</w:t>
+        <w:t xml:space="preserve"> Har download count </w:t>
+      </w:r>
+      <w:proofErr w:type="spellStart"/>
+      <w:r>
+        <w:t>badhta</w:t>
+      </w:r>
+      <w:proofErr w:type="spellEnd"/>
+      <w:r>
+        <w:t xml:space="preserve"> </w:t>
+      </w:r>
+      <w:proofErr w:type="spellStart"/>
+      <w:r>
+        <w:t>dikhe</w:t>
+      </w:r>
+      <w:proofErr w:type="spellEnd"/>
+      <w:r>
+        <w:t>, spam requests block ho.</w:t>
       </w:r>
     </w:p>
     <w:p>
@@ -1364,7 +2402,31 @@
         <w:t>Cover:</w:t>
       </w:r>
       <w:r>
-        <w:t xml:space="preserve"> OpenAPI/Swagger ka concept — production API me docs kyun zaroori hain.</w:t>
+        <w:t xml:space="preserve"> </w:t>
+      </w:r>
+      <w:proofErr w:type="spellStart"/>
+      <w:r>
+        <w:t>OpenAPI</w:t>
+      </w:r>
+      <w:proofErr w:type="spellEnd"/>
+      <w:r>
+        <w:t xml:space="preserve">/Swagger ka concept — production API me docs kyun </w:t>
+      </w:r>
+      <w:proofErr w:type="spellStart"/>
+      <w:r>
+        <w:t>zaroori</w:t>
+      </w:r>
+      <w:proofErr w:type="spellEnd"/>
+      <w:r>
+        <w:t xml:space="preserve"> </w:t>
+      </w:r>
+      <w:proofErr w:type="spellStart"/>
+      <w:r>
+        <w:t>hain</w:t>
+      </w:r>
+      <w:proofErr w:type="spellEnd"/>
+      <w:r>
+        <w:t>.</w:t>
       </w:r>
     </w:p>
     <w:p>
@@ -1382,7 +2444,15 @@
         <w:t>Code:</w:t>
       </w:r>
       <w:r>
-        <w:t xml:space="preserve"> drf-spectacular install, Swagger UI setup.</w:t>
+        <w:t xml:space="preserve"> </w:t>
+      </w:r>
+      <w:proofErr w:type="spellStart"/>
+      <w:r>
+        <w:t>drf</w:t>
+      </w:r>
+      <w:proofErr w:type="spellEnd"/>
+      <w:r>
+        <w:t>-spectacular install, Swagger UI setup.</w:t>
       </w:r>
     </w:p>
     <w:p>
@@ -1400,13 +2470,21 @@
         <w:t>Deliverable:</w:t>
       </w:r>
       <w:r>
-        <w:t xml:space="preserve"> /api/docs/ pe pura interactive API documentation.</w:t>
+        <w:t xml:space="preserve"> /</w:t>
+      </w:r>
+      <w:proofErr w:type="spellStart"/>
+      <w:r>
+        <w:t>api</w:t>
+      </w:r>
+      <w:proofErr w:type="spellEnd"/>
+      <w:r>
+        <w:t>/docs/ pe pura interactive API documentation.</w:t>
       </w:r>
     </w:p>
     <w:p>
       <w:r>
         <w:pict w14:anchorId="423EFFB2">
-          <v:rect id="_x0000_i1058" style="width:0;height:1.5pt" o:hralign="center" o:hrstd="t" o:hr="t" fillcolor="#a0a0a0" stroked="f"/>
+          <v:rect id="_x0000_i1028" style="width:0;height:1.5pt" o:hralign="center" o:hrstd="t" o:hr="t" fillcolor="#a0a0a0" stroked="f"/>
         </w:pict>
       </w:r>
     </w:p>
@@ -1455,7 +2533,31 @@
         <w:t>Cover:</w:t>
       </w:r>
       <w:r>
-        <w:t xml:space="preserve"> Secrets ko code me hardcode kyun nahi karte, django-environ.</w:t>
+        <w:t xml:space="preserve"> Secrets ko code me hardcode kyun </w:t>
+      </w:r>
+      <w:proofErr w:type="spellStart"/>
+      <w:r>
+        <w:t>nahi</w:t>
+      </w:r>
+      <w:proofErr w:type="spellEnd"/>
+      <w:r>
+        <w:t xml:space="preserve"> </w:t>
+      </w:r>
+      <w:proofErr w:type="spellStart"/>
+      <w:r>
+        <w:t>karte</w:t>
+      </w:r>
+      <w:proofErr w:type="spellEnd"/>
+      <w:r>
+        <w:t xml:space="preserve">, </w:t>
+      </w:r>
+      <w:proofErr w:type="spellStart"/>
+      <w:r>
+        <w:t>django</w:t>
+      </w:r>
+      <w:proofErr w:type="spellEnd"/>
+      <w:r>
+        <w:t>-environ.</w:t>
       </w:r>
     </w:p>
     <w:p>
@@ -1473,7 +2575,15 @@
         <w:t>Code:</w:t>
       </w:r>
       <w:r>
-        <w:t xml:space="preserve"> .env file banao (SECRET_KEY, DB credentials), settings/base.py, dev.py, prod.py split.</w:t>
+        <w:t xml:space="preserve"> .env file </w:t>
+      </w:r>
+      <w:proofErr w:type="spellStart"/>
+      <w:r>
+        <w:t>banao</w:t>
+      </w:r>
+      <w:proofErr w:type="spellEnd"/>
+      <w:r>
+        <w:t xml:space="preserve"> (SECRET_KEY, DB credentials), settings/base.py, dev.py, prod.py split.</w:t>
       </w:r>
     </w:p>
     <w:p>
@@ -1491,7 +2601,55 @@
         <w:t>Deliverable:</w:t>
       </w:r>
       <w:r>
-        <w:t xml:space="preserve"> Koi bhi secret git me na ho, .env.example file bhi banao.</w:t>
+        <w:t xml:space="preserve"> Koi </w:t>
+      </w:r>
+      <w:proofErr w:type="spellStart"/>
+      <w:r>
+        <w:t>bhi</w:t>
+      </w:r>
+      <w:proofErr w:type="spellEnd"/>
+      <w:r>
+        <w:t xml:space="preserve"> secret git me </w:t>
+      </w:r>
+      <w:proofErr w:type="spellStart"/>
+      <w:r>
+        <w:t>na</w:t>
+      </w:r>
+      <w:proofErr w:type="spellEnd"/>
+      <w:r>
+        <w:t xml:space="preserve"> ho</w:t>
+      </w:r>
+      <w:proofErr w:type="gramStart"/>
+      <w:r>
+        <w:t>, .</w:t>
+      </w:r>
+      <w:proofErr w:type="spellStart"/>
+      <w:r>
+        <w:t>env</w:t>
+      </w:r>
+      <w:proofErr w:type="gramEnd"/>
+      <w:r>
+        <w:t>.example</w:t>
+      </w:r>
+      <w:proofErr w:type="spellEnd"/>
+      <w:r>
+        <w:t xml:space="preserve"> file </w:t>
+      </w:r>
+      <w:proofErr w:type="spellStart"/>
+      <w:r>
+        <w:t>bhi</w:t>
+      </w:r>
+      <w:proofErr w:type="spellEnd"/>
+      <w:r>
+        <w:t xml:space="preserve"> </w:t>
+      </w:r>
+      <w:proofErr w:type="spellStart"/>
+      <w:r>
+        <w:t>banao</w:t>
+      </w:r>
+      <w:proofErr w:type="spellEnd"/>
+      <w:r>
+        <w:t>.</w:t>
       </w:r>
     </w:p>
     <w:p>
@@ -1524,7 +2682,23 @@
         <w:t>Cover:</w:t>
       </w:r>
       <w:r>
-        <w:t xml:space="preserve"> Unit test vs API test, Django TestCase / APITestCase.</w:t>
+        <w:t xml:space="preserve"> Unit test vs API test, Django </w:t>
+      </w:r>
+      <w:proofErr w:type="spellStart"/>
+      <w:r>
+        <w:t>TestCase</w:t>
+      </w:r>
+      <w:proofErr w:type="spellEnd"/>
+      <w:r>
+        <w:t xml:space="preserve"> / </w:t>
+      </w:r>
+      <w:proofErr w:type="spellStart"/>
+      <w:r>
+        <w:t>APITestCase</w:t>
+      </w:r>
+      <w:proofErr w:type="spellEnd"/>
+      <w:r>
+        <w:t>.</w:t>
       </w:r>
     </w:p>
     <w:p>
@@ -1542,7 +2716,23 @@
         <w:t>Code:</w:t>
       </w:r>
       <w:r>
-        <w:t xml:space="preserve"> Models ke liye 2-3 tests, ek auth flow test, ek permission test.</w:t>
+        <w:t xml:space="preserve"> Models </w:t>
+      </w:r>
+      <w:proofErr w:type="spellStart"/>
+      <w:r>
+        <w:t>ke</w:t>
+      </w:r>
+      <w:proofErr w:type="spellEnd"/>
+      <w:r>
+        <w:t xml:space="preserve"> </w:t>
+      </w:r>
+      <w:proofErr w:type="spellStart"/>
+      <w:r>
+        <w:t>liye</w:t>
+      </w:r>
+      <w:proofErr w:type="spellEnd"/>
+      <w:r>
+        <w:t xml:space="preserve"> 2-3 tests, ek auth flow test, ek permission test.</w:t>
       </w:r>
     </w:p>
     <w:p>
@@ -1629,7 +2819,15 @@
         <w:t>Deliverable:</w:t>
       </w:r>
       <w:r>
-        <w:t xml:space="preserve"> Error hone pe proper JSON error response (500 raw error page nahi).</w:t>
+        <w:t xml:space="preserve"> Error hone pe proper JSON error response (500 raw error page </w:t>
+      </w:r>
+      <w:proofErr w:type="spellStart"/>
+      <w:r>
+        <w:t>nahi</w:t>
+      </w:r>
+      <w:proofErr w:type="spellEnd"/>
+      <w:r>
+        <w:t>).</w:t>
       </w:r>
     </w:p>
     <w:p>
@@ -1662,7 +2860,39 @@
         <w:t>Cover:</w:t>
       </w:r>
       <w:r>
-        <w:t xml:space="preserve"> Background task kyun chahiye (e.g. email notification blocking response nahi karni chahiye).</w:t>
+        <w:t xml:space="preserve"> Background task kyun </w:t>
+      </w:r>
+      <w:proofErr w:type="spellStart"/>
+      <w:r>
+        <w:t>chahiye</w:t>
+      </w:r>
+      <w:proofErr w:type="spellEnd"/>
+      <w:r>
+        <w:t xml:space="preserve"> (e.g. email notification blocking response </w:t>
+      </w:r>
+      <w:proofErr w:type="spellStart"/>
+      <w:r>
+        <w:t>nahi</w:t>
+      </w:r>
+      <w:proofErr w:type="spellEnd"/>
+      <w:r>
+        <w:t xml:space="preserve"> </w:t>
+      </w:r>
+      <w:proofErr w:type="spellStart"/>
+      <w:r>
+        <w:t>karni</w:t>
+      </w:r>
+      <w:proofErr w:type="spellEnd"/>
+      <w:r>
+        <w:t xml:space="preserve"> </w:t>
+      </w:r>
+      <w:proofErr w:type="spellStart"/>
+      <w:r>
+        <w:t>chahiye</w:t>
+      </w:r>
+      <w:proofErr w:type="spellEnd"/>
+      <w:r>
+        <w:t>).</w:t>
       </w:r>
     </w:p>
     <w:p>
@@ -1680,7 +2910,15 @@
         <w:t>Code:</w:t>
       </w:r>
       <w:r>
-        <w:t xml:space="preserve"> Basic Celery + Redis setup, ek simple task (naya resource upload hone pe log/email trigger).</w:t>
+        <w:t xml:space="preserve"> Basic Celery + Redis setup, ek simple task (</w:t>
+      </w:r>
+      <w:proofErr w:type="spellStart"/>
+      <w:r>
+        <w:t>naya</w:t>
+      </w:r>
+      <w:proofErr w:type="spellEnd"/>
+      <w:r>
+        <w:t xml:space="preserve"> resource upload hone pe log/email trigger).</w:t>
       </w:r>
     </w:p>
     <w:p>
@@ -1698,7 +2936,39 @@
         <w:t>Deliverable:</w:t>
       </w:r>
       <w:r>
-        <w:t xml:space="preserve"> Task async chale, response turant wapas aaye.</w:t>
+        <w:t xml:space="preserve"> Task async </w:t>
+      </w:r>
+      <w:proofErr w:type="spellStart"/>
+      <w:r>
+        <w:t>chale</w:t>
+      </w:r>
+      <w:proofErr w:type="spellEnd"/>
+      <w:r>
+        <w:t xml:space="preserve">, response </w:t>
+      </w:r>
+      <w:proofErr w:type="spellStart"/>
+      <w:r>
+        <w:t>turant</w:t>
+      </w:r>
+      <w:proofErr w:type="spellEnd"/>
+      <w:r>
+        <w:t xml:space="preserve"> </w:t>
+      </w:r>
+      <w:proofErr w:type="spellStart"/>
+      <w:r>
+        <w:t>wapas</w:t>
+      </w:r>
+      <w:proofErr w:type="spellEnd"/>
+      <w:r>
+        <w:t xml:space="preserve"> </w:t>
+      </w:r>
+      <w:proofErr w:type="spellStart"/>
+      <w:r>
+        <w:t>aaye</w:t>
+      </w:r>
+      <w:proofErr w:type="spellEnd"/>
+      <w:r>
+        <w:t>.</w:t>
       </w:r>
     </w:p>
     <w:p>
@@ -1731,7 +3001,39 @@
         <w:t>Cover:</w:t>
       </w:r>
       <w:r>
-        <w:t xml:space="preserve"> Django admin customization (list_display, search_fields, list_filter, inlines).</w:t>
+        <w:t xml:space="preserve"> Django admin customization (</w:t>
+      </w:r>
+      <w:proofErr w:type="spellStart"/>
+      <w:r>
+        <w:t>list_display</w:t>
+      </w:r>
+      <w:proofErr w:type="spellEnd"/>
+      <w:r>
+        <w:t xml:space="preserve">, </w:t>
+      </w:r>
+      <w:proofErr w:type="spellStart"/>
+      <w:r>
+        <w:t>search_fields</w:t>
+      </w:r>
+      <w:proofErr w:type="spellEnd"/>
+      <w:r>
+        <w:t xml:space="preserve">, </w:t>
+      </w:r>
+      <w:proofErr w:type="spellStart"/>
+      <w:r>
+        <w:t>list_filter</w:t>
+      </w:r>
+      <w:proofErr w:type="spellEnd"/>
+      <w:r>
+        <w:t xml:space="preserve">, </w:t>
+      </w:r>
+      <w:proofErr w:type="spellStart"/>
+      <w:r>
+        <w:t>inlines</w:t>
+      </w:r>
+      <w:proofErr w:type="spellEnd"/>
+      <w:r>
+        <w:t>).</w:t>
       </w:r>
     </w:p>
     <w:p>
@@ -1746,10 +3048,27 @@
           <w:b/>
           <w:bCs/>
         </w:rPr>
+        <w:lastRenderedPageBreak/>
         <w:t>Code:</w:t>
       </w:r>
       <w:r>
-        <w:t xml:space="preserve"> Sab models ka admin polish karo; pura backend end-to-end test karo (Postman collection banao); API README likho.</w:t>
+        <w:t xml:space="preserve"> Sab models ka admin polish karo; pura backend end-to-end test karo (Postman collection </w:t>
+      </w:r>
+      <w:proofErr w:type="spellStart"/>
+      <w:r>
+        <w:t>banao</w:t>
+      </w:r>
+      <w:proofErr w:type="spellEnd"/>
+      <w:r>
+        <w:t xml:space="preserve">); API README </w:t>
+      </w:r>
+      <w:proofErr w:type="spellStart"/>
+      <w:r>
+        <w:t>likho</w:t>
+      </w:r>
+      <w:proofErr w:type="spellEnd"/>
+      <w:r>
+        <w:t>.</w:t>
       </w:r>
     </w:p>
     <w:p>
@@ -1773,7 +3092,7 @@
     <w:p>
       <w:r>
         <w:pict w14:anchorId="05E418B9">
-          <v:rect id="_x0000_i1059" style="width:0;height:1.5pt" o:hralign="center" o:hrstd="t" o:hr="t" fillcolor="#a0a0a0" stroked="f"/>
+          <v:rect id="_x0000_i1029" style="width:0;height:1.5pt" o:hralign="center" o:hrstd="t" o:hr="t" fillcolor="#a0a0a0" stroked="f"/>
         </w:pict>
       </w:r>
     </w:p>
@@ -1807,7 +3126,15 @@
         <w:t>Frontend Phase</w:t>
       </w:r>
       <w:r>
-        <w:t xml:space="preserve"> (React — separate ~15-20 day plan)</w:t>
+        <w:t xml:space="preserve"> (React — separate ~15-</w:t>
+      </w:r>
+      <w:proofErr w:type="gramStart"/>
+      <w:r>
+        <w:t>20 day</w:t>
+      </w:r>
+      <w:proofErr w:type="gramEnd"/>
+      <w:r>
+        <w:t xml:space="preserve"> plan)</w:t>
       </w:r>
     </w:p>
     <w:p>
@@ -1817,6 +3144,7 @@
           <w:numId w:val="21"/>
         </w:numPr>
       </w:pPr>
+      <w:proofErr w:type="spellStart"/>
       <w:r>
         <w:rPr>
           <w:b/>
@@ -1824,6 +3152,7 @@
         </w:rPr>
         <w:t>Dockerization</w:t>
       </w:r>
+      <w:proofErr w:type="spellEnd"/>
       <w:r>
         <w:t xml:space="preserve"> (backend + frontend + Postgres containerize)</w:t>
       </w:r>
@@ -1843,7 +3172,15 @@
         <w:t>Deployment</w:t>
       </w:r>
       <w:r>
-        <w:t xml:space="preserve"> (Railway/Render + Vercel/Netlify, CI/CD basics)</w:t>
+        <w:t xml:space="preserve"> (Railway/Render + </w:t>
+      </w:r>
+      <w:proofErr w:type="spellStart"/>
+      <w:r>
+        <w:t>Vercel</w:t>
+      </w:r>
+      <w:proofErr w:type="spellEnd"/>
+      <w:r>
+        <w:t>/Netlify, CI/CD basics)</w:t>
       </w:r>
     </w:p>
     <w:p/>
@@ -5621,6 +6958,7 @@
   <w:style w:type="character" w:default="1" w:styleId="DefaultParagraphFont">
     <w:name w:val="Default Paragraph Font"/>
     <w:uiPriority w:val="1"/>
+    <w:semiHidden/>
     <w:unhideWhenUsed/>
   </w:style>
   <w:style w:type="table" w:default="1" w:styleId="TableNormal">

</xml_diff>